<commit_message>
Finish the extension-module pass in the reference doc
Leftovers from describing the extensions as separate services: the
Portfolio and Notifications dependencies, the singular scope and
showcase rows, and the OWASP row.

Also corrects the branching model in all nine component showcases. The
India material asks for a pull request into the team's main branch; the
rows still said develop.
</commit_message>
<xml_diff>
--- a/references/Enterprise_Trading_Platform_Project_India.docx
+++ b/references/Enterprise_Trading_Platform_Project_India.docx
@@ -10948,7 +10948,7 @@
                 <w:sz w:val="20"/>
                 <w:szCs w:val="20"/>
               </w:rPr>
-              <w:t>Feature branch merged to develop</w:t>
+              <w:t>Feature branch merged to the team's main branch</w:t>
             </w:r>
           </w:p>
         </w:tc>
@@ -13208,7 +13208,7 @@
                 <w:sz w:val="20"/>
                 <w:szCs w:val="20"/>
               </w:rPr>
-              <w:t>Feature branch merged to develop</w:t>
+              <w:t>Feature branch merged to the team's main branch</w:t>
             </w:r>
           </w:p>
         </w:tc>
@@ -15175,7 +15175,7 @@
                 <w:sz w:val="20"/>
                 <w:szCs w:val="20"/>
               </w:rPr>
-              <w:t>Feature branch merged to develop</w:t>
+              <w:t>Feature branch merged to the team's main branch</w:t>
             </w:r>
           </w:p>
         </w:tc>
@@ -17359,7 +17359,7 @@
                 <w:sz w:val="20"/>
                 <w:szCs w:val="20"/>
               </w:rPr>
-              <w:t>Feature branch merged to develop</w:t>
+              <w:t>Feature branch merged to the team's main branch</w:t>
             </w:r>
           </w:p>
         </w:tc>
@@ -19243,7 +19243,7 @@
                 <w:sz w:val="20"/>
                 <w:szCs w:val="20"/>
               </w:rPr>
-              <w:t>Feature branch merged to develop</w:t>
+              <w:t>Feature branch merged to the team's main branch</w:t>
             </w:r>
           </w:p>
         </w:tc>
@@ -21460,7 +21460,7 @@
                 <w:sz w:val="20"/>
                 <w:szCs w:val="20"/>
               </w:rPr>
-              <w:t>Feature branch merged to develop</w:t>
+              <w:t>Feature branch merged to the team's main branch</w:t>
             </w:r>
           </w:p>
         </w:tc>
@@ -23562,7 +23562,7 @@
                 <w:sz w:val="20"/>
                 <w:szCs w:val="20"/>
               </w:rPr>
-              <w:t>Feature branch merged to develop</w:t>
+              <w:t>Feature branch merged to the team's main branch</w:t>
             </w:r>
           </w:p>
         </w:tc>
@@ -24234,7 +24234,7 @@
                 <w:sz w:val="20"/>
                 <w:szCs w:val="20"/>
               </w:rPr>
-              <w:t>Research-driven BUY / SELL / HOLD signals against holdings and watchlist, with the reasoning behind each. Builds on: market &amp; price data (S4) and the Portfolio service; analytics layer.</w:t>
+              <w:t>Research-driven BUY / SELL / HOLD signals against holdings and watchlist, with the reasoning behind each. Builds on: market &amp; price data (S4) and the Portfolio &amp; P&amp;L moduleervice; analytics layer.</w:t>
             </w:r>
           </w:p>
         </w:tc>
@@ -24445,7 +24445,7 @@
                 <w:sz w:val="20"/>
                 <w:szCs w:val="20"/>
               </w:rPr>
-              <w:t>Watchlists with price or volatility thresholds that trigger real-time alerts. Builds on: real-time price stream (S7, Kafka) and the Notifications service.</w:t>
+              <w:t>Watchlists with price or volatility thresholds that trigger real-time alerts. Builds on: real-time price stream (S7, Kafka) and the Notifications module.</w:t>
             </w:r>
           </w:p>
         </w:tc>
@@ -24783,7 +24783,7 @@
                 <w:sz w:val="20"/>
                 <w:szCs w:val="20"/>
               </w:rPr>
-              <w:t>Confirm extension and integration plan</w:t>
+              <w:t>Confirm the four modules and the integration plan</w:t>
             </w:r>
           </w:p>
         </w:tc>
@@ -25149,7 +25149,7 @@
                 <w:sz w:val="20"/>
                 <w:szCs w:val="20"/>
               </w:rPr>
-              <w:t>Apply OWASP principles to the new service</w:t>
+              <w:t>Apply OWASP principles to the new modules</w:t>
             </w:r>
           </w:p>
         </w:tc>
@@ -25565,7 +25565,7 @@
                 <w:sz w:val="20"/>
                 <w:szCs w:val="20"/>
               </w:rPr>
-              <w:t>Working Extension</w:t>
+              <w:t>Working Extensions</w:t>
             </w:r>
           </w:p>
         </w:tc>
@@ -25595,7 +25595,7 @@
                 <w:sz w:val="20"/>
                 <w:szCs w:val="20"/>
               </w:rPr>
-              <w:t>Chosen service integrated end-to-end</w:t>
+              <w:t>Four modules integrated end-to-end</w:t>
             </w:r>
           </w:p>
         </w:tc>
@@ -25790,7 +25790,7 @@
                 <w:sz w:val="20"/>
                 <w:szCs w:val="20"/>
               </w:rPr>
-              <w:t>Feature branch merged to develop</w:t>
+              <w:t>Feature branch merged to the team's main branch</w:t>
             </w:r>
           </w:p>
         </w:tc>

</xml_diff>

<commit_message>
Drop the last team-selected extension wording from the showcases
The three showcase rows still described the extension work as one
distinctive capability the team picks.
</commit_message>
<xml_diff>
--- a/references/Enterprise_Trading_Platform_Project_India.docx
+++ b/references/Enterprise_Trading_Platform_Project_India.docx
@@ -2489,7 +2489,7 @@
                 <w:sz w:val="20"/>
                 <w:szCs w:val="20"/>
               </w:rPr>
-              <w:t>Distinctive team feature</w:t>
+              <w:t>Four integrated platform features</w:t>
             </w:r>
           </w:p>
         </w:tc>
@@ -3450,7 +3450,7 @@
           <w:sz w:val="21"/>
           <w:szCs w:val="21"/>
         </w:rPr>
-        <w:t>A distinctive, team-selected capability integrated into the platform</w:t>
+        <w:t>Four extension modules integrated into the platform</w:t>
       </w:r>
     </w:p>
     <w:p>
@@ -4396,7 +4396,7 @@
                 <w:sz w:val="20"/>
                 <w:szCs w:val="20"/>
               </w:rPr>
-              <w:t>Distinctive platform capability</w:t>
+              <w:t>Four integrated platform capabilities</w:t>
             </w:r>
           </w:p>
         </w:tc>

</xml_diff>